<commit_message>
Retire the 21-book EE scaffolding so the series stays on nine volumes.
Co-authored-by: Cursor <cursoragent@cursor.com>
</commit_message>
<xml_diff>
--- a/EE - Series/EE1/Foundations_Book1.docx
+++ b/EE - Series/EE1/Foundations_Book1.docx
@@ -269,7 +269,7 @@
         <w:spacing w:after="200" w:line="276"/>
       </w:pPr>
       <w:r>
-        <w:t xml:space="preserve">This book is the first of twenty-one, together covering the full breadth of electrical engineering from first principles through to its specialized and emerging edges. Each of the twenty-one books corresponds to one tier of a single master topic list, built so that each tier's material is gathered into one volume rather than scattered across a shelf of disconnected textbooks, and so that each book assumes only the books before it — never the ones after.</w:t>
+        <w:t>This book is the first of nine, together covering the full breadth of electrical engineering from first principles through to its specialized and emerging edges. Each of the nine books corresponds to one tier of a single master topic list, built so that each tier's material is gathered into one volume rather than scattered across a shelf of disconnected textbooks, and so that each book assumes only the books before it — never the ones after.</w:t>
       </w:r>
     </w:p>
     <w:p>
@@ -304,11 +304,7 @@
           </w:tcPr>
           <w:p>
             <w:r>
-              <w:rPr>
-                <w:b/>
-                <w:bCs/>
-              </w:rPr>
-              <w:t xml:space="preserve">Book</w:t>
+              <w:t>Book</w:t>
             </w:r>
           </w:p>
         </w:tc>
@@ -319,11 +315,7 @@
           </w:tcPr>
           <w:p>
             <w:r>
-              <w:rPr>
-                <w:b/>
-                <w:bCs/>
-              </w:rPr>
-              <w:t xml:space="preserve">Covers</w:t>
+              <w:t>Covers</w:t>
             </w:r>
           </w:p>
         </w:tc>
@@ -335,7 +327,7 @@
           </w:tcPr>
           <w:p>
             <w:r>
-              <w:t xml:space="preserve">1. Foundations</w:t>
+              <w:t>1. Foundations (this book)</w:t>
             </w:r>
           </w:p>
         </w:tc>
@@ -345,7 +337,7 @@
           </w:tcPr>
           <w:p>
             <w:r>
-              <w:t xml:space="preserve">This book — physics, mathematics, and circuit theory</w:t>
+              <w:t>Physics, mathematics, and circuit theory</w:t>
             </w:r>
           </w:p>
         </w:tc>
@@ -357,7 +349,7 @@
           </w:tcPr>
           <w:p>
             <w:r>
-              <w:t xml:space="preserve">2. Core Circuits and Components</w:t>
+              <w:t>2. Circuits, Components, and Control</w:t>
             </w:r>
           </w:p>
         </w:tc>
@@ -367,7 +359,7 @@
           </w:tcPr>
           <w:p>
             <w:r>
-              <w:t xml:space="preserve">Network and transient analysis, resistors/capacitors/inductors as real components</w:t>
+              <w:t>Analog and digital, op-amps, passives, the classical loop</w:t>
             </w:r>
           </w:p>
         </w:tc>
@@ -379,7 +371,7 @@
           </w:tcPr>
           <w:p>
             <w:r>
-              <w:t xml:space="preserve">3. Semiconductor Physics and Devices</w:t>
+              <w:t>3. Semiconductor Physics and Devices</w:t>
             </w:r>
           </w:p>
         </w:tc>
@@ -389,7 +381,7 @@
           </w:tcPr>
           <w:p>
             <w:r>
-              <w:t xml:space="preserve">Diodes, BJTs, MOSFETs, advanced materials, fabrication and packaging</w:t>
+              <w:t>Diodes, BJTs, MOSFETs, FinFET, compound semiconductors</w:t>
             </w:r>
           </w:p>
         </w:tc>
@@ -401,7 +393,7 @@
           </w:tcPr>
           <w:p>
             <w:r>
-              <w:t xml:space="preserve">4. RF and High-Frequency Engineering</w:t>
+              <w:t>4. RF, Microwave, and Antennas</w:t>
             </w:r>
           </w:p>
         </w:tc>
@@ -411,7 +403,7 @@
           </w:tcPr>
           <w:p>
             <w:r>
-              <w:t xml:space="preserve">Transmission lines, S-parameters, RF components and measurements</w:t>
+              <w:t>Matching, lines, microwave, mmWave, antennas</w:t>
             </w:r>
           </w:p>
         </w:tc>
@@ -423,7 +415,7 @@
           </w:tcPr>
           <w:p>
             <w:r>
-              <w:t xml:space="preserve">5. Noise and System Performance</w:t>
+              <w:t>5. Communications, Wireless, and SDR</w:t>
             </w:r>
           </w:p>
         </w:tc>
@@ -433,7 +425,7 @@
           </w:tcPr>
           <w:p>
             <w:r>
-              <w:t xml:space="preserve">Thermal, shot, and flicker noise; noise figure; SNR and BER</w:t>
+              <w:t>Modulation, band plans, DSP and software radio</w:t>
             </w:r>
           </w:p>
         </w:tc>
@@ -445,7 +437,7 @@
           </w:tcPr>
           <w:p>
             <w:r>
-              <w:t xml:space="preserve">6. Modulation and Communication Theory</w:t>
+              <w:t>6. Transceivers and High-Power RF</w:t>
             </w:r>
           </w:p>
         </w:tc>
@@ -455,7 +447,7 @@
           </w:tcPr>
           <w:p>
             <w:r>
-              <w:t xml:space="preserve">AM/FM/PM, digital modulation, coding, Shannon capacity</w:t>
+              <w:t>Noise, PLL, PAs, combiners, radar</w:t>
             </w:r>
           </w:p>
         </w:tc>
@@ -467,7 +459,7 @@
           </w:tcPr>
           <w:p>
             <w:r>
-              <w:t xml:space="preserve">7. PLL and Frequency Synthesis</w:t>
+              <w:t>7. EMC, Simulation, and Test</w:t>
             </w:r>
           </w:p>
         </w:tc>
@@ -477,7 +469,7 @@
           </w:tcPr>
           <w:p>
             <w:r>
-              <w:t xml:space="preserve">Phase detectors, loop filters, VCOs, frequency synthesizers</w:t>
+              <w:t>Emissions, immunity, solvers, the accredited lab</w:t>
             </w:r>
           </w:p>
         </w:tc>
@@ -489,7 +481,7 @@
           </w:tcPr>
           <w:p>
             <w:r>
-              <w:t xml:space="preserve">8. Microwave Engineering (1–30 GHz)</w:t>
+              <w:t>8. Power and Energy</w:t>
             </w:r>
           </w:p>
         </w:tc>
@@ -499,7 +491,7 @@
           </w:tcPr>
           <w:p>
             <w:r>
-              <w:t xml:space="preserve">Waveguides, resonators, microstrip and stripline design</w:t>
+              <w:t>Regulators, magnetics, the grid, the rack</w:t>
             </w:r>
           </w:p>
         </w:tc>
@@ -511,7 +503,7 @@
           </w:tcPr>
           <w:p>
             <w:r>
-              <w:t xml:space="preserve">9. mmWave Engineering (30–300 GHz)</w:t>
+              <w:t>9. Packaging, Layout, and Emerging</w:t>
             </w:r>
           </w:p>
         </w:tc>
@@ -521,271 +513,7 @@
           </w:tcPr>
           <w:p>
             <w:r>
-              <w:t xml:space="preserve">Propagation, packaging, phased arrays, 5G/6G systems</w:t>
-            </w:r>
-          </w:p>
-        </w:tc>
-      </w:tr>
-      <w:tr>
-        <w:tc>
-          <w:tcPr>
-            <w:tcW w:type="dxa" w:w="4500"/>
-          </w:tcPr>
-          <w:p>
-            <w:r>
-              <w:t xml:space="preserve">10. Antennas and Radiation</w:t>
-            </w:r>
-          </w:p>
-        </w:tc>
-        <w:tc>
-          <w:tcPr>
-            <w:tcW w:type="dxa" w:w="4500"/>
-          </w:tcPr>
-          <w:p>
-            <w:r>
-              <w:t xml:space="preserve">Antenna theory, radiation patterns, antenna simulation tools</w:t>
-            </w:r>
-          </w:p>
-        </w:tc>
-      </w:tr>
-      <w:tr>
-        <w:tc>
-          <w:tcPr>
-            <w:tcW w:type="dxa" w:w="4500"/>
-          </w:tcPr>
-          <w:p>
-            <w:r>
-              <w:t xml:space="preserve">11. EMC, EMI, and Emissions</w:t>
-            </w:r>
-          </w:p>
-        </w:tc>
-        <w:tc>
-          <w:tcPr>
-            <w:tcW w:type="dxa" w:w="4500"/>
-          </w:tcPr>
-          <w:p>
-            <w:r>
-              <w:t xml:space="preserve">Conducted and radiated emissions, shielding, regulatory standards</w:t>
-            </w:r>
-          </w:p>
-        </w:tc>
-      </w:tr>
-      <w:tr>
-        <w:tc>
-          <w:tcPr>
-            <w:tcW w:type="dxa" w:w="4500"/>
-          </w:tcPr>
-          <w:p>
-            <w:r>
-              <w:t xml:space="preserve">12. Wireless Systems and Protocols</w:t>
-            </w:r>
-          </w:p>
-        </w:tc>
-        <w:tc>
-          <w:tcPr>
-            <w:tcW w:type="dxa" w:w="4500"/>
-          </w:tcPr>
-          <w:p>
-            <w:r>
-              <w:t xml:space="preserve">Wi-Fi, Bluetooth, cellular architecture, MIMO systems</w:t>
-            </w:r>
-          </w:p>
-        </w:tc>
-      </w:tr>
-      <w:tr>
-        <w:tc>
-          <w:tcPr>
-            <w:tcW w:type="dxa" w:w="4500"/>
-          </w:tcPr>
-          <w:p>
-            <w:r>
-              <w:t xml:space="preserve">13. Radar Systems</w:t>
-            </w:r>
-          </w:p>
-        </w:tc>
-        <w:tc>
-          <w:tcPr>
-            <w:tcW w:type="dxa" w:w="4500"/>
-          </w:tcPr>
-          <w:p>
-            <w:r>
-              <w:t xml:space="preserve">Pulsed, CW, and FMCW radar; SAR; automotive radar</w:t>
-            </w:r>
-          </w:p>
-        </w:tc>
-      </w:tr>
-      <w:tr>
-        <w:tc>
-          <w:tcPr>
-            <w:tcW w:type="dxa" w:w="4500"/>
-          </w:tcPr>
-          <w:p>
-            <w:r>
-              <w:t xml:space="preserve">14. DSP and Software-Defined Radio</w:t>
-            </w:r>
-          </w:p>
-        </w:tc>
-        <w:tc>
-          <w:tcPr>
-            <w:tcW w:type="dxa" w:w="4500"/>
-          </w:tcPr>
-          <w:p>
-            <w:r>
-              <w:t xml:space="preserve">Sampling, digital filters, the FFT, SDR platforms</w:t>
-            </w:r>
-          </w:p>
-        </w:tc>
-      </w:tr>
-      <w:tr>
-        <w:tc>
-          <w:tcPr>
-            <w:tcW w:type="dxa" w:w="4500"/>
-          </w:tcPr>
-          <w:p>
-            <w:r>
-              <w:t xml:space="preserve">15. Power and Energy</w:t>
-            </w:r>
-          </w:p>
-        </w:tc>
-        <w:tc>
-          <w:tcPr>
-            <w:tcW w:type="dxa" w:w="4500"/>
-          </w:tcPr>
-          <w:p>
-            <w:r>
-              <w:t xml:space="preserve">Power systems, transformers, three-phase systems, renewables</w:t>
-            </w:r>
-          </w:p>
-        </w:tc>
-      </w:tr>
-      <w:tr>
-        <w:tc>
-          <w:tcPr>
-            <w:tcW w:type="dxa" w:w="4500"/>
-          </w:tcPr>
-          <w:p>
-            <w:r>
-              <w:t xml:space="preserve">16. Control and Automation</w:t>
-            </w:r>
-          </w:p>
-        </w:tc>
-        <w:tc>
-          <w:tcPr>
-            <w:tcW w:type="dxa" w:w="4500"/>
-          </w:tcPr>
-          <w:p>
-            <w:r>
-              <w:t xml:space="preserve">Feedback systems, stability, PID control, robotics</w:t>
-            </w:r>
-          </w:p>
-        </w:tc>
-      </w:tr>
-      <w:tr>
-        <w:tc>
-          <w:tcPr>
-            <w:tcW w:type="dxa" w:w="4500"/>
-          </w:tcPr>
-          <w:p>
-            <w:r>
-              <w:t xml:space="preserve">17. Oscillators, Modulators, and Transceivers</w:t>
-            </w:r>
-          </w:p>
-        </w:tc>
-        <w:tc>
-          <w:tcPr>
-            <w:tcW w:type="dxa" w:w="4500"/>
-          </w:tcPr>
-          <w:p>
-            <w:r>
-              <w:t xml:space="preserve">Oscillator topologies, receiver architectures, power-amplifier techniques</w:t>
-            </w:r>
-          </w:p>
-        </w:tc>
-      </w:tr>
-      <w:tr>
-        <w:tc>
-          <w:tcPr>
-            <w:tcW w:type="dxa" w:w="4500"/>
-          </w:tcPr>
-          <w:p>
-            <w:r>
-              <w:t xml:space="preserve">18. Technologies, Layout, and Packaging</w:t>
-            </w:r>
-          </w:p>
-        </w:tc>
-        <w:tc>
-          <w:tcPr>
-            <w:tcW w:type="dxa" w:w="4500"/>
-          </w:tcPr>
-          <w:p>
-            <w:r>
-              <w:t xml:space="preserve">PCB design, high-speed layout, substrates, advanced packaging</w:t>
-            </w:r>
-          </w:p>
-        </w:tc>
-      </w:tr>
-      <w:tr>
-        <w:tc>
-          <w:tcPr>
-            <w:tcW w:type="dxa" w:w="4500"/>
-          </w:tcPr>
-          <w:p>
-            <w:r>
-              <w:t xml:space="preserve">19. Simulation Tools and Methods</w:t>
-            </w:r>
-          </w:p>
-        </w:tc>
-        <w:tc>
-          <w:tcPr>
-            <w:tcW w:type="dxa" w:w="4500"/>
-          </w:tcPr>
-          <w:p>
-            <w:r>
-              <w:t xml:space="preserve">SPICE, ADS, HFSS, CST, and circuit/EM co-simulation</w:t>
-            </w:r>
-          </w:p>
-        </w:tc>
-      </w:tr>
-      <w:tr>
-        <w:tc>
-          <w:tcPr>
-            <w:tcW w:type="dxa" w:w="4500"/>
-          </w:tcPr>
-          <w:p>
-            <w:r>
-              <w:t xml:space="preserve">20. Debug and Validation</w:t>
-            </w:r>
-          </w:p>
-        </w:tc>
-        <w:tc>
-          <w:tcPr>
-            <w:tcW w:type="dxa" w:w="4500"/>
-          </w:tcPr>
-          <w:p>
-            <w:r>
-              <w:t xml:space="preserve">Oscilloscope, spectrum analyzer, and VNA debugging; failure analysis</w:t>
-            </w:r>
-          </w:p>
-        </w:tc>
-      </w:tr>
-      <w:tr>
-        <w:tc>
-          <w:tcPr>
-            <w:tcW w:type="dxa" w:w="4500"/>
-          </w:tcPr>
-          <w:p>
-            <w:r>
-              <w:t xml:space="preserve">21. Emerging Technologies</w:t>
-            </w:r>
-          </w:p>
-        </w:tc>
-        <w:tc>
-          <w:tcPr>
-            <w:tcW w:type="dxa" w:w="4500"/>
-          </w:tcPr>
-          <w:p>
-            <w:r>
-              <w:t xml:space="preserve">6G, terahertz electronics, quantum devices, photonics, AI-driven RF design</w:t>
+              <w:t>Boards, packages, 2026 compute, robots, MEMS</w:t>
             </w:r>
           </w:p>
         </w:tc>
@@ -814,11 +542,9 @@
           <w:b/>
           <w:bCs/>
         </w:rPr>
-        <w:t xml:space="preserve">You do not need the other twenty books to use this one.</w:t>
-      </w:r>
-      <w:r>
-        <w:t xml:space="preserve"> This book, and each book after it, is written to stand on its own given its stated prerequisites — almost always just the books before it in the list above. Treat the table as a map of where you have been and where a given later interest can take you, not as a syllabus you must complete in order.</w:t>
-      </w:r>
+        <w:t>You do not need the other eight books to use this one. This book, and each book after it, is written to stand on its own given its stated prerequisites — almost always just the books before it in the list above. Treat the table as a map of where you have been and where a given later interest can take you, not as a syllabus you must complete in order.</w:t>
+      </w:r>
+      <w:r/>
     </w:p>
     <w:p>
       <w:r>

</xml_diff>